<commit_message>
Update 2. Bimby and DSF Data.docx
</commit_message>
<xml_diff>
--- a/documentation/2. Bimby and DSF Data.docx
+++ b/documentation/2. Bimby and DSF Data.docx
@@ -307,21 +307,7 @@
                 <w:rStyle w:val="Hyperlink"/>
                 <w:noProof/>
               </w:rPr>
-              <w:t xml:space="preserve">Include </w:t>
-            </w:r>
-            <w:r>
-              <w:rPr>
-                <w:rStyle w:val="Hyperlink"/>
-                <w:noProof/>
-              </w:rPr>
-              <w:t>U</w:t>
-            </w:r>
-            <w:r>
-              <w:rPr>
-                <w:rStyle w:val="Hyperlink"/>
-                <w:noProof/>
-              </w:rPr>
-              <w:t>sers (Automation)</w:t>
+              <w:t>Include Users (Automation)</w:t>
             </w:r>
             <w:r>
               <w:rPr>
@@ -1163,7 +1149,15 @@
         </w:numPr>
       </w:pPr>
       <w:r>
-        <w:t>Select ‘place_state_name’</w:t>
+        <w:t>Select ‘</w:t>
+      </w:r>
+      <w:proofErr w:type="spellStart"/>
+      <w:r>
+        <w:t>place_state_name</w:t>
+      </w:r>
+      <w:proofErr w:type="spellEnd"/>
+      <w:r>
+        <w:t>’</w:t>
       </w:r>
     </w:p>
     <w:p>
@@ -1175,7 +1169,15 @@
         </w:numPr>
       </w:pPr>
       <w:r>
-        <w:t>Select ‘taxon_family_name’</w:t>
+        <w:t>Select ‘</w:t>
+      </w:r>
+      <w:proofErr w:type="spellStart"/>
+      <w:r>
+        <w:t>taxon_family_name</w:t>
+      </w:r>
+      <w:proofErr w:type="spellEnd"/>
+      <w:r>
+        <w:t>’</w:t>
       </w:r>
     </w:p>
     <w:p>
@@ -1341,7 +1343,15 @@
         <w:t>Save excel in “</w:t>
       </w:r>
       <w:r>
-        <w:t>D:\PythonScripts\iNat\Duplicates</w:t>
+        <w:t>D:\</w:t>
+      </w:r>
+      <w:proofErr w:type="spellStart"/>
+      <w:r>
+        <w:t>PythonScripts</w:t>
+      </w:r>
+      <w:proofErr w:type="spellEnd"/>
+      <w:r>
+        <w:t>\iNat\Duplicates</w:t>
       </w:r>
       <w:r>
         <w:t>”</w:t>
@@ -1440,7 +1450,15 @@
         <w:t xml:space="preserve">Enter : </w:t>
       </w:r>
       <w:r>
-        <w:t>butterflies-in-my-backyard-bimby-project</w:t>
+        <w:t>butterflies-in-my-backyard-</w:t>
+      </w:r>
+      <w:proofErr w:type="spellStart"/>
+      <w:r>
+        <w:t>bimby</w:t>
+      </w:r>
+      <w:proofErr w:type="spellEnd"/>
+      <w:r>
+        <w:t>-project</w:t>
       </w:r>
     </w:p>
     <w:p>
@@ -1631,7 +1649,13 @@
         </w:numPr>
       </w:pPr>
       <w:r>
-        <w:t>Then D is a copy pastre, values only</w:t>
+        <w:t xml:space="preserve">Then D is a copy </w:t>
+      </w:r>
+      <w:r>
+        <w:t>paste</w:t>
+      </w:r>
+      <w:r>
+        <w:t>, values only</w:t>
       </w:r>
     </w:p>
     <w:p>
@@ -1680,8 +1704,13 @@
         </w:numPr>
       </w:pPr>
       <w:r>
-        <w:t>Store G-Sheets at My Drive &gt; iNaturalist &gt; 2024 etc</w:t>
-      </w:r>
+        <w:t xml:space="preserve">Store G-Sheets at My Drive &gt; iNaturalist &gt; 2024 </w:t>
+      </w:r>
+      <w:proofErr w:type="spellStart"/>
+      <w:r>
+        <w:t>etc</w:t>
+      </w:r>
+      <w:proofErr w:type="spellEnd"/>
     </w:p>
     <w:p>
       <w:pPr>
@@ -2108,7 +2137,21 @@
         <w:rPr>
           <w:lang w:val="en-US"/>
         </w:rPr>
-        <w:t>Select place_state_name in the GEO section</w:t>
+        <w:t xml:space="preserve">Select </w:t>
+      </w:r>
+      <w:proofErr w:type="spellStart"/>
+      <w:r>
+        <w:rPr>
+          <w:lang w:val="en-US"/>
+        </w:rPr>
+        <w:t>place_state_name</w:t>
+      </w:r>
+      <w:proofErr w:type="spellEnd"/>
+      <w:r>
+        <w:rPr>
+          <w:lang w:val="en-US"/>
+        </w:rPr>
+        <w:t xml:space="preserve"> in the GEO section</w:t>
       </w:r>
     </w:p>
     <w:p>
@@ -2465,9 +2508,17 @@
         <w:rPr>
           <w:lang w:val="en-US"/>
         </w:rPr>
-        <w:t>Code APIs and DB etc</w:t>
+        <w:t xml:space="preserve">Code APIs and DB </w:t>
+      </w:r>
+      <w:proofErr w:type="spellStart"/>
+      <w:r>
+        <w:rPr>
+          <w:lang w:val="en-US"/>
+        </w:rPr>
+        <w:t>etc</w:t>
       </w:r>
       <w:bookmarkEnd w:id="10"/>
+      <w:proofErr w:type="spellEnd"/>
     </w:p>
     <w:p>
       <w:pPr>
@@ -2682,11 +2733,19 @@
         </w:rPr>
         <w:t>using “</w:t>
       </w:r>
-      <w:r>
-        <w:rPr>
-          <w:lang w:val="en-US"/>
-        </w:rPr>
-        <w:t xml:space="preserve">iconic_taxon_name </w:t>
+      <w:proofErr w:type="spellStart"/>
+      <w:r>
+        <w:rPr>
+          <w:lang w:val="en-US"/>
+        </w:rPr>
+        <w:t>iconic_taxon_name</w:t>
+      </w:r>
+      <w:proofErr w:type="spellEnd"/>
+      <w:r>
+        <w:rPr>
+          <w:lang w:val="en-US"/>
+        </w:rPr>
+        <w:t xml:space="preserve"> </w:t>
       </w:r>
       <w:r>
         <w:rPr>
@@ -2736,11 +2795,19 @@
         </w:rPr>
         <w:t>delete using “</w:t>
       </w:r>
-      <w:r>
-        <w:rPr>
-          <w:lang w:val="en-US"/>
-        </w:rPr>
-        <w:t xml:space="preserve">iconic_taxon_name </w:t>
+      <w:proofErr w:type="spellStart"/>
+      <w:r>
+        <w:rPr>
+          <w:lang w:val="en-US"/>
+        </w:rPr>
+        <w:t>iconic_taxon_name</w:t>
+      </w:r>
+      <w:proofErr w:type="spellEnd"/>
+      <w:r>
+        <w:rPr>
+          <w:lang w:val="en-US"/>
+        </w:rPr>
+        <w:t xml:space="preserve"> </w:t>
       </w:r>
       <w:r>
         <w:rPr>
@@ -2848,7 +2915,21 @@
         <w:rPr>
           <w:lang w:val="en-US"/>
         </w:rPr>
-        <w:t>Move url field to the first column</w:t>
+        <w:t xml:space="preserve">Move </w:t>
+      </w:r>
+      <w:proofErr w:type="spellStart"/>
+      <w:r>
+        <w:rPr>
+          <w:lang w:val="en-US"/>
+        </w:rPr>
+        <w:t>url</w:t>
+      </w:r>
+      <w:proofErr w:type="spellEnd"/>
+      <w:r>
+        <w:rPr>
+          <w:lang w:val="en-US"/>
+        </w:rPr>
+        <w:t xml:space="preserve"> field to the first column</w:t>
       </w:r>
     </w:p>
     <w:p>
@@ -2885,8 +2966,16 @@
         <w:rPr>
           <w:lang w:val="en-US"/>
         </w:rPr>
-        <w:t xml:space="preserve"> column/url</w:t>
-      </w:r>
+        <w:t xml:space="preserve"> column/</w:t>
+      </w:r>
+      <w:proofErr w:type="spellStart"/>
+      <w:r>
+        <w:rPr>
+          <w:lang w:val="en-US"/>
+        </w:rPr>
+        <w:t>url</w:t>
+      </w:r>
+      <w:proofErr w:type="spellEnd"/>
     </w:p>
     <w:p>
       <w:pPr>
@@ -3134,8 +3223,16 @@
         <w:rPr>
           <w:lang w:val="en-US"/>
         </w:rPr>
-        <w:t>Column 38 is common_name</w:t>
-      </w:r>
+        <w:t xml:space="preserve">Column 38 is </w:t>
+      </w:r>
+      <w:proofErr w:type="spellStart"/>
+      <w:r>
+        <w:rPr>
+          <w:lang w:val="en-US"/>
+        </w:rPr>
+        <w:t>common_name</w:t>
+      </w:r>
+      <w:proofErr w:type="spellEnd"/>
     </w:p>
     <w:p>
       <w:pPr>
@@ -3179,8 +3276,16 @@
         <w:rPr>
           <w:lang w:val="en-US"/>
         </w:rPr>
-        <w:t>Column 12 is quality_grade</w:t>
-      </w:r>
+        <w:t xml:space="preserve">Column 12 is </w:t>
+      </w:r>
+      <w:proofErr w:type="spellStart"/>
+      <w:r>
+        <w:rPr>
+          <w:lang w:val="en-US"/>
+        </w:rPr>
+        <w:t>quality_grade</w:t>
+      </w:r>
+      <w:proofErr w:type="spellEnd"/>
     </w:p>
     <w:p>
       <w:pPr>
@@ -5077,6 +5182,7 @@
   <w:style w:type="character" w:default="1" w:styleId="DefaultParagraphFont">
     <w:name w:val="Default Paragraph Font"/>
     <w:uiPriority w:val="1"/>
+    <w:semiHidden/>
     <w:unhideWhenUsed/>
   </w:style>
   <w:style w:type="table" w:default="1" w:styleId="TableNormal">

</xml_diff>